<commit_message>
Roehampton: Club lease plan from the registered 2021 demise, parking folded into the demise plan, three plans only
Co-Authored-By: Claude Fable 5.1 <noreply@anthropic.com>
Claude-Session: https://claude.ai/code/session_01PFPSEueuEDo5NrLkRsAgfj
</commit_message>
<xml_diff>
--- a/client/public/share/roehampton-sports-ground-estate-k7x2/docs/Roehampton - Proposal to AELTC - draft.docx
+++ b/client/public/share/roehampton-sports-ground-estate-k7x2/docs/Roehampton - Proposal to AELTC - draft.docx
@@ -98,7 +98,7 @@
           <w:sz w:val="21"/>
           <w:szCs w:val="21"/>
         </w:rPr>
-        <w:t xml:space="preserve">The Club holds a lease of the whole of Lot 2, the Sports Centre and Grounds, granted by the Bank of England in June 2021. It runs to 2036 with a tenant break in 2031; the rent is £350,000 a year, stepping to £675,000 from 2031. It is outside the 1954 Act.</w:t>
+        <w:t xml:space="preserve">The Club holds a lease of the Sports Centre and Grounds granted by the Bank of England in June 2021; the lease plan excludes The Grange and the main car park. It runs to 2036 with a tenant break in 2031; the rent is £350,000 a year, stepping to £675,000 from 2031. It is outside the 1954 Act.</w:t>
       </w:r>
     </w:p>
     <w:p>
@@ -1557,7 +1557,233 @@
           <w:sz w:val="24"/>
           <w:szCs w:val="24"/>
         </w:rPr>
-        <w:t xml:space="preserve">5. Points to settle</w:t>
+        <w:t xml:space="preserve">5. The plan</w:t>
+      </w:r>
+    </w:p>
+    <w:p>
+      <w:pPr>
+        <w:spacing w:after="140" w:line="300"/>
+      </w:pPr>
+      <w:r>
+        <w:rPr>
+          <w:rFonts w:ascii="Calibri" w:cs="Calibri" w:eastAsia="Calibri" w:hAnsi="Calibri"/>
+          <w:color w:val="1D1D1B"/>
+          <w:sz w:val="21"/>
+          <w:szCs w:val="21"/>
+        </w:rPr>
+        <w:t xml:space="preserve">The plan below is the Club's 2021 lease plan from the data room registered onto the 2019 topographic survey. The new demise is in green, about 9.5 hectares against the 10.7 hectares surrendered; what comes out, the Sports Club, the permanent Pavilion and the 2G pitch, is in bordeaux. The Squash Courts are added to the Club's demise. The side column repeats the annual cycle in section 4.</w:t>
+      </w:r>
+    </w:p>
+    <w:p>
+      <w:pPr>
+        <w:spacing w:after="160"/>
+      </w:pPr>
+      <w:r>
+        <w:drawing>
+          <wp:inline distT="0" distB="0" distL="0" distR="0">
+            <wp:extent cx="5905500" cy="5381625"/>
+            <wp:effectExtent t="0" r="0" b="0" l="0"/>
+            <wp:docPr id="1" name="" descr="" title=""/>
+            <wp:cNvGraphicFramePr>
+              <a:graphicFrameLocks xmlns:a="http://schemas.openxmlformats.org/drawingml/2006/main" noChangeAspect="1"/>
+            </wp:cNvGraphicFramePr>
+            <a:graphic xmlns:a="http://schemas.openxmlformats.org/drawingml/2006/main">
+              <a:graphicData uri="http://schemas.openxmlformats.org/drawingml/2006/picture">
+                <pic:pic xmlns:pic="http://schemas.openxmlformats.org/drawingml/2006/picture">
+                  <pic:nvPicPr>
+                    <pic:cNvPr id="0" name="" descr=""/>
+                    <pic:cNvPicPr>
+                      <a:picLocks noChangeAspect="1" noChangeArrowheads="1"/>
+                    </pic:cNvPicPr>
+                  </pic:nvPicPr>
+                  <pic:blipFill>
+                    <a:blip r:embed="rId9" cstate="none"/>
+                    <a:srcRect/>
+                    <a:stretch>
+                      <a:fillRect/>
+                    </a:stretch>
+                  </pic:blipFill>
+                  <pic:spPr bwMode="auto">
+                    <a:xfrm>
+                      <a:off x="0" y="0"/>
+                      <a:ext cx="5905500" cy="5381625"/>
+                    </a:xfrm>
+                    <a:prstGeom prst="rect">
+                      <a:avLst/>
+                    </a:prstGeom>
+                  </pic:spPr>
+                </pic:pic>
+              </a:graphicData>
+            </a:graphic>
+          </wp:inline>
+        </w:drawing>
+      </w:r>
+    </w:p>
+    <w:p>
+      <w:pPr>
+        <w:pStyle w:val="Heading2"/>
+        <w:spacing w:after="100" w:before="260"/>
+      </w:pPr>
+      <w:r>
+        <w:rPr>
+          <w:rFonts w:ascii="Calibri" w:cs="Calibri" w:eastAsia="Calibri" w:hAnsi="Calibri"/>
+          <w:b/>
+          <w:bCs/>
+          <w:color w:val="6E0C25"/>
+          <w:sz w:val="24"/>
+          <w:szCs w:val="24"/>
+        </w:rPr>
+        <w:t xml:space="preserve">6. How the site is serviced for the Qualifying</w:t>
+      </w:r>
+    </w:p>
+    <w:p>
+      <w:pPr>
+        <w:pStyle w:val="ListParagraph"/>
+        <w:numPr>
+          <w:ilvl w:val="0"/>
+          <w:numId w:val="2"/>
+        </w:numPr>
+        <w:spacing w:after="80" w:line="290"/>
+      </w:pPr>
+      <w:r>
+        <w:rPr>
+          <w:rFonts w:ascii="Calibri" w:cs="Calibri" w:eastAsia="Calibri" w:hAnsi="Calibri"/>
+          <w:color w:val="1D1D1B"/>
+          <w:sz w:val="21"/>
+          <w:szCs w:val="21"/>
+        </w:rPr>
+        <w:t xml:space="preserve">Courts and play: the grass courts in the north-west strip (1 to 30 on the 2021 plan) and the main fields for the show court, temporary stands and practice, as now. Nothing in the Third Space demise is needed for play.</w:t>
+      </w:r>
+    </w:p>
+    <w:p>
+      <w:pPr>
+        <w:pStyle w:val="ListParagraph"/>
+        <w:numPr>
+          <w:ilvl w:val="0"/>
+          <w:numId w:val="2"/>
+        </w:numPr>
+        <w:spacing w:after="80" w:line="290"/>
+      </w:pPr>
+      <w:r>
+        <w:rPr>
+          <w:rFonts w:ascii="Calibri" w:cs="Calibri" w:eastAsia="Calibri" w:hAnsi="Calibri"/>
+          <w:color w:val="1D1D1B"/>
+          <w:sz w:val="21"/>
+          <w:szCs w:val="21"/>
+        </w:rPr>
+        <w:t xml:space="preserve">Players and officials: the temporary pavilion at the north end of the Pavilion (4,778 sq ft) and the Squash Courts (3,233 sq ft over two floors, the first floor for officials), both inside the Club's new lease, with cabins on the fields within the consent.</w:t>
+      </w:r>
+    </w:p>
+    <w:p>
+      <w:pPr>
+        <w:pStyle w:val="ListParagraph"/>
+        <w:numPr>
+          <w:ilvl w:val="0"/>
+          <w:numId w:val="2"/>
+        </w:numPr>
+        <w:spacing w:after="80" w:line="290"/>
+      </w:pPr>
+      <w:r>
+        <w:rPr>
+          <w:rFonts w:ascii="Calibri" w:cs="Calibri" w:eastAsia="Calibri" w:hAnsi="Calibri"/>
+          <w:color w:val="1D1D1B"/>
+          <w:sz w:val="21"/>
+          <w:szCs w:val="21"/>
+        </w:rPr>
+        <w:t xml:space="preserve">Hospitality and media: the Pavilion function hall, bars and roof terrace under the annual option from Third Space, booked by 1 March; otherwise marquees on the fields as consented.</w:t>
+      </w:r>
+    </w:p>
+    <w:p>
+      <w:pPr>
+        <w:pStyle w:val="ListParagraph"/>
+        <w:numPr>
+          <w:ilvl w:val="0"/>
+          <w:numId w:val="2"/>
+        </w:numPr>
+        <w:spacing w:after="80" w:line="290"/>
+      </w:pPr>
+      <w:r>
+        <w:rPr>
+          <w:rFonts w:ascii="Calibri" w:cs="Calibri" w:eastAsia="Calibri" w:hAnsi="Calibri"/>
+          <w:color w:val="1D1D1B"/>
+          <w:sz w:val="21"/>
+          <w:szCs w:val="21"/>
+        </w:rPr>
+        <w:t xml:space="preserve">Access: event vehicles, the build and spectators through Gate 1, the Bank Lane barrier, under the traffic plan, with the drive past The Grange and the road west of it to the fields; Third Space's members keep Gate 2 and car park A and are not affected.</w:t>
+      </w:r>
+    </w:p>
+    <w:p>
+      <w:pPr>
+        <w:pStyle w:val="ListParagraph"/>
+        <w:numPr>
+          <w:ilvl w:val="0"/>
+          <w:numId w:val="2"/>
+        </w:numPr>
+        <w:spacing w:after="80" w:line="290"/>
+      </w:pPr>
+      <w:r>
+        <w:rPr>
+          <w:rFonts w:ascii="Calibri" w:cs="Calibri" w:eastAsia="Calibri" w:hAnsi="Calibri"/>
+          <w:color w:val="1D1D1B"/>
+          <w:sz w:val="21"/>
+          <w:szCs w:val="21"/>
+        </w:rPr>
+        <w:t xml:space="preserve">Parking: event parking on the western playing field as now, with up to 30 bays in car park A by arrangement with Third Space. Car park A was never in the Club's 2021 lease, so nothing changes there on the surrender.</w:t>
+      </w:r>
+    </w:p>
+    <w:p>
+      <w:pPr>
+        <w:pStyle w:val="ListParagraph"/>
+        <w:numPr>
+          <w:ilvl w:val="0"/>
+          <w:numId w:val="2"/>
+        </w:numPr>
+        <w:spacing w:after="80" w:line="290"/>
+      </w:pPr>
+      <w:r>
+        <w:rPr>
+          <w:rFonts w:ascii="Calibri" w:cs="Calibri" w:eastAsia="Calibri" w:hAnsi="Calibri"/>
+          <w:color w:val="1D1D1B"/>
+          <w:sz w:val="21"/>
+          <w:szCs w:val="21"/>
+        </w:rPr>
+        <w:t xml:space="preserve">Services and welfare: the Club's existing cabins, toilets and power on the fields within the 2025 consent; water and power connections at the temporary pavilion kept on the surrender.</w:t>
+      </w:r>
+    </w:p>
+    <w:p>
+      <w:pPr>
+        <w:pStyle w:val="ListParagraph"/>
+        <w:numPr>
+          <w:ilvl w:val="0"/>
+          <w:numId w:val="2"/>
+        </w:numPr>
+        <w:spacing w:after="80" w:line="290"/>
+      </w:pPr>
+      <w:r>
+        <w:rPr>
+          <w:rFonts w:ascii="Calibri" w:cs="Calibri" w:eastAsia="Calibri" w:hAnsi="Calibri"/>
+          <w:color w:val="1D1D1B"/>
+          <w:sz w:val="21"/>
+          <w:szCs w:val="21"/>
+        </w:rPr>
+        <w:t xml:space="preserve">Community sport: hard courts, grass practice courts and pitches outside the Qualifying period, booked as now.</w:t>
+      </w:r>
+    </w:p>
+    <w:p>
+      <w:pPr>
+        <w:pStyle w:val="Heading2"/>
+        <w:spacing w:after="100" w:before="260"/>
+      </w:pPr>
+      <w:r>
+        <w:rPr>
+          <w:rFonts w:ascii="Calibri" w:cs="Calibri" w:eastAsia="Calibri" w:hAnsi="Calibri"/>
+          <w:b/>
+          <w:bCs/>
+          <w:color w:val="6E0C25"/>
+          <w:sz w:val="24"/>
+          <w:szCs w:val="24"/>
+        </w:rPr>
+        <w:t xml:space="preserve">7. Points to settle</w:t>
       </w:r>
     </w:p>
     <w:p>

</xml_diff>

<commit_message>
Roehampton: operator demise as one parcel to Woody's line; Club lease the complement; David Lloyd plan PDF
</commit_message>
<xml_diff>
--- a/client/public/share/roehampton-sports-ground-estate-k7x2/docs/Roehampton - Proposal to AELTC - draft.docx
+++ b/client/public/share/roehampton-sports-ground-estate-k7x2/docs/Roehampton - Proposal to AELTC - draft.docx
@@ -266,7 +266,7 @@
                 <w:sz w:val="21"/>
                 <w:szCs w:val="21"/>
               </w:rPr>
-              <w:t xml:space="preserve">The grass courts and playing fields, the hard courts, the long-standing temporary pavilion at the north end of the Pavilion with its link and porch (about 4,780 sq ft), the Squash Courts building (3,233 sq ft) for player, official and storage use, and the groundsman's compound. The Sports Club, the Pavilion, car parks A and B, The Grange and the cottages are excluded.</w:t>
+              <w:t xml:space="preserve">The grass courts and playing fields, the hard courts, the long-standing temporary pavilion at the north end of the Pavilion with its link and porch (about 4,780 sq ft), the Squash Courts building (3,233 sq ft) for player, official and storage use, and the groundsman's compound. The Sports Club, the Pavilion and their grounds (the garden and forecourt west of the Pavilion, the land east and south of the Sports Club to the Tennis Centre fence), the 2G pitch, car parks A and B, The Grange and the cottages are excluded.</w:t>
             </w:r>
           </w:p>
         </w:tc>
@@ -1571,7 +1571,7 @@
           <w:sz w:val="21"/>
           <w:szCs w:val="21"/>
         </w:rPr>
-        <w:t xml:space="preserve">The plan below is the Club's 2021 lease plan from the data room registered onto the 2019 topographic survey. The new demise is in green, about 8.1 hectares against the 10.6 hectares surrendered: the playing fields and grass courts, the temporary pavilion and the Squash Courts. What comes out is the Sports Club, the permanent Pavilion and the 2G pitch, in bordeaux, together with the land around them and the strip along the eastern boundary, so that the Club's demise is the fields and nothing around the leisure buildings. The side column repeats the annual cycle in section 4.</w:t>
+        <w:t xml:space="preserve">The plan below is the Club's 2021 lease plan from the data room registered onto the 2019 topographic survey. The new demise is in green, about 7.9 hectares against the 10.6 hectares surrendered: the playing fields and grass courts, the temporary pavilion and the Squash Courts. What comes out is the Sports Club, the permanent Pavilion and the 2G pitch, in bordeaux, together with the land around them and the strip along the eastern boundary, so that the Club's demise is the fields and nothing around the leisure buildings. The side column repeats the annual cycle in section 4.</w:t>
       </w:r>
     </w:p>
     <w:p>

</xml_diff>